<commit_message>
Pflichtenheft implementiert und Datenbankänderungen angepasst. Wir werden eine neue Technologie für die Website benutzen, deswegen ist bei der WebAnwendung alles gelöscht
</commit_message>
<xml_diff>
--- a/Dokumentation/Lastenheft_pflichtenheft_LockUpLogic.docx
+++ b/Dokumentation/Lastenheft_pflichtenheft_LockUpLogic.docx
@@ -585,7 +585,16 @@
           <w:sz w:val="32"/>
           <w:szCs w:val="32"/>
         </w:rPr>
-        <w:t>Datenbankanforderungen</w:t>
+        <w:t>Datenbankan</w:t>
+      </w:r>
+      <w:r>
+        <w:rPr>
+          <w:b/>
+          <w:bCs/>
+          <w:sz w:val="32"/>
+          <w:szCs w:val="32"/>
+        </w:rPr>
+        <w:t>passungen</w:t>
       </w:r>
     </w:p>
     <w:p>
@@ -734,14 +743,7 @@
           <w:b/>
           <w:bCs/>
         </w:rPr>
-        <w:t>PERSON_ID</w:t>
-      </w:r>
-      <w:r>
-        <w:rPr>
-          <w:b/>
-          <w:bCs/>
-        </w:rPr>
-        <w:t>,</w:t>
+        <w:t>PERSON_ID,</w:t>
       </w:r>
       <w:r>
         <w:rPr>
@@ -836,14 +838,7 @@
           <w:b/>
           <w:bCs/>
         </w:rPr>
-        <w:t>GEFANGENENNAME</w:t>
-      </w:r>
-      <w:r>
-        <w:rPr>
-          <w:b/>
-          <w:bCs/>
-        </w:rPr>
-        <w:t>,</w:t>
+        <w:t>GEFANGENENNAME,</w:t>
       </w:r>
       <w:r>
         <w:rPr>
@@ -887,14 +882,7 @@
           <w:b/>
           <w:bCs/>
         </w:rPr>
-        <w:t>DATUM</w:t>
-      </w:r>
-      <w:r>
-        <w:rPr>
-          <w:b/>
-          <w:bCs/>
-        </w:rPr>
-        <w:t>)</w:t>
+        <w:t>DATUM)</w:t>
       </w:r>
       <w:r>
         <w:rPr>
@@ -1307,8 +1295,1058 @@
     </w:p>
     <w:p>
       <w:pPr>
+        <w:pStyle w:val="Listenabsatz"/>
+        <w:numPr>
+          <w:ilvl w:val="0"/>
+          <w:numId w:val="6"/>
+        </w:numPr>
+        <w:rPr>
+          <w:b/>
+          <w:bCs/>
+          <w:sz w:val="32"/>
+          <w:szCs w:val="32"/>
+        </w:rPr>
+      </w:pPr>
+      <w:r>
+        <w:rPr>
+          <w:b/>
+          <w:bCs/>
+          <w:sz w:val="32"/>
+          <w:szCs w:val="32"/>
+        </w:rPr>
+        <w:t>Technische Architektur</w:t>
+      </w:r>
+    </w:p>
+    <w:p>
+      <w:pPr>
+        <w:pStyle w:val="Listenabsatz"/>
+        <w:numPr>
+          <w:ilvl w:val="0"/>
+          <w:numId w:val="2"/>
+        </w:numPr>
+      </w:pPr>
+      <w:r>
+        <w:t>HTML</w:t>
+      </w:r>
+    </w:p>
+    <w:p>
+      <w:pPr>
+        <w:pStyle w:val="Listenabsatz"/>
+        <w:numPr>
+          <w:ilvl w:val="0"/>
+          <w:numId w:val="2"/>
+        </w:numPr>
+      </w:pPr>
+      <w:r>
+        <w:t>PHP</w:t>
+      </w:r>
+    </w:p>
+    <w:p>
+      <w:pPr>
+        <w:pStyle w:val="Listenabsatz"/>
+        <w:numPr>
+          <w:ilvl w:val="0"/>
+          <w:numId w:val="2"/>
+        </w:numPr>
+      </w:pPr>
+      <w:r>
+        <w:t>CSS</w:t>
+      </w:r>
+    </w:p>
+    <w:p>
+      <w:pPr>
+        <w:pStyle w:val="Listenabsatz"/>
+        <w:numPr>
+          <w:ilvl w:val="0"/>
+          <w:numId w:val="2"/>
+        </w:numPr>
+      </w:pPr>
+      <w:r>
+        <w:t>ORACLE DBMS</w:t>
+      </w:r>
+    </w:p>
+    <w:p>
+      <w:pPr>
+        <w:pStyle w:val="Listenabsatz"/>
+      </w:pPr>
+    </w:p>
+    <w:p>
+      <w:pPr>
+        <w:pStyle w:val="Listenabsatz"/>
+        <w:numPr>
+          <w:ilvl w:val="0"/>
+          <w:numId w:val="6"/>
+        </w:numPr>
+        <w:rPr>
+          <w:b/>
+          <w:bCs/>
+          <w:sz w:val="32"/>
+          <w:szCs w:val="32"/>
+        </w:rPr>
+      </w:pPr>
+      <w:r>
+        <w:rPr>
+          <w:b/>
+          <w:bCs/>
+          <w:sz w:val="32"/>
+          <w:szCs w:val="32"/>
+        </w:rPr>
+        <w:t>Aufwandsschätzung</w:t>
+      </w:r>
+    </w:p>
+    <w:tbl>
+      <w:tblPr>
+        <w:tblStyle w:val="Tabellenraster"/>
+        <w:tblW w:w="0" w:type="auto"/>
+        <w:tblInd w:w="360" w:type="dxa"/>
+        <w:tblLook w:val="04A0" w:firstRow="1" w:lastRow="0" w:firstColumn="1" w:lastColumn="0" w:noHBand="0" w:noVBand="1"/>
+      </w:tblPr>
+      <w:tblGrid>
+        <w:gridCol w:w="3037"/>
+        <w:gridCol w:w="4484"/>
+        <w:gridCol w:w="1181"/>
+      </w:tblGrid>
+      <w:tr>
+        <w:tc>
+          <w:tcPr>
+            <w:tcW w:w="3037" w:type="dxa"/>
+          </w:tcPr>
+          <w:p>
+            <w:pPr>
+              <w:rPr>
+                <w:b/>
+                <w:bCs/>
+              </w:rPr>
+            </w:pPr>
+            <w:r>
+              <w:rPr>
+                <w:b/>
+                <w:bCs/>
+              </w:rPr>
+              <w:t>Arbeitspaket</w:t>
+            </w:r>
+          </w:p>
+        </w:tc>
+        <w:tc>
+          <w:tcPr>
+            <w:tcW w:w="4484" w:type="dxa"/>
+          </w:tcPr>
+          <w:p>
+            <w:pPr>
+              <w:rPr>
+                <w:b/>
+                <w:bCs/>
+              </w:rPr>
+            </w:pPr>
+            <w:r>
+              <w:rPr>
+                <w:b/>
+                <w:bCs/>
+              </w:rPr>
+              <w:t>Beschreibung</w:t>
+            </w:r>
+          </w:p>
+        </w:tc>
+        <w:tc>
+          <w:tcPr>
+            <w:tcW w:w="1181" w:type="dxa"/>
+          </w:tcPr>
+          <w:p>
+            <w:pPr>
+              <w:rPr>
+                <w:b/>
+                <w:bCs/>
+              </w:rPr>
+            </w:pPr>
+            <w:r>
+              <w:rPr>
+                <w:b/>
+                <w:bCs/>
+              </w:rPr>
+              <w:t>Aufwand</w:t>
+            </w:r>
+          </w:p>
+        </w:tc>
+      </w:tr>
+      <w:tr>
+        <w:tc>
+          <w:tcPr>
+            <w:tcW w:w="3037" w:type="dxa"/>
+          </w:tcPr>
+          <w:p>
+            <w:r>
+              <w:t>Analyse Lastenheft</w:t>
+            </w:r>
+          </w:p>
+        </w:tc>
+        <w:tc>
+          <w:tcPr>
+            <w:tcW w:w="4484" w:type="dxa"/>
+          </w:tcPr>
+          <w:p>
+            <w:r>
+              <w:t>Anforderungen verstehen, Prozesse extrahieren</w:t>
+            </w:r>
+          </w:p>
+        </w:tc>
+        <w:tc>
+          <w:tcPr>
+            <w:tcW w:w="1181" w:type="dxa"/>
+          </w:tcPr>
+          <w:p>
+            <w:r>
+              <w:t>1</w:t>
+            </w:r>
+          </w:p>
+        </w:tc>
+      </w:tr>
+      <w:tr>
+        <w:tc>
+          <w:tcPr>
+            <w:tcW w:w="3037" w:type="dxa"/>
+          </w:tcPr>
+          <w:p>
+            <w:r>
+              <w:t>Detaillierte Prozessanalyse</w:t>
+            </w:r>
+          </w:p>
+        </w:tc>
+        <w:tc>
+          <w:tcPr>
+            <w:tcW w:w="4484" w:type="dxa"/>
+          </w:tcPr>
+          <w:p>
+            <w:r>
+              <w:t>Besucherprozess, Validierungsprozess, Statusprozess im Detail modellieren</w:t>
+            </w:r>
+          </w:p>
+        </w:tc>
+        <w:tc>
+          <w:tcPr>
+            <w:tcW w:w="1181" w:type="dxa"/>
+          </w:tcPr>
+          <w:p>
+            <w:r>
+              <w:t>2</w:t>
+            </w:r>
+          </w:p>
+        </w:tc>
+      </w:tr>
+      <w:tr>
+        <w:tc>
+          <w:tcPr>
+            <w:tcW w:w="3037" w:type="dxa"/>
+          </w:tcPr>
+          <w:p>
+            <w:r>
+              <w:t>Technische Architektur</w:t>
+            </w:r>
+          </w:p>
+        </w:tc>
+        <w:tc>
+          <w:tcPr>
+            <w:tcW w:w="4484" w:type="dxa"/>
+          </w:tcPr>
+          <w:p>
+            <w:r>
+              <w:t>Technische Architektur</w:t>
+            </w:r>
+            <w:r>
+              <w:t xml:space="preserve"> verstehen und aufsetzen</w:t>
+            </w:r>
+          </w:p>
+        </w:tc>
+        <w:tc>
+          <w:tcPr>
+            <w:tcW w:w="1181" w:type="dxa"/>
+          </w:tcPr>
+          <w:p>
+            <w:r>
+              <w:t>1</w:t>
+            </w:r>
+          </w:p>
+        </w:tc>
+      </w:tr>
+      <w:tr>
+        <w:tc>
+          <w:tcPr>
+            <w:tcW w:w="3037" w:type="dxa"/>
+          </w:tcPr>
+          <w:p>
+            <w:r>
+              <w:t>Datenban</w:t>
+            </w:r>
+            <w:r>
+              <w:t>kanpassungen</w:t>
+            </w:r>
+          </w:p>
+        </w:tc>
+        <w:tc>
+          <w:tcPr>
+            <w:tcW w:w="4484" w:type="dxa"/>
+          </w:tcPr>
+          <w:p>
+            <w:r>
+              <w:t>Tabellen erweitern (Gefangener, Besucher), neue Tabelle Besuchszeiten modellieren</w:t>
+            </w:r>
+            <w:r>
+              <w:t xml:space="preserve">, </w:t>
+            </w:r>
+            <w:proofErr w:type="spellStart"/>
+            <w:r>
+              <w:t>views</w:t>
+            </w:r>
+            <w:proofErr w:type="spellEnd"/>
+            <w:r>
+              <w:t xml:space="preserve"> und </w:t>
+            </w:r>
+            <w:proofErr w:type="spellStart"/>
+            <w:r>
+              <w:t>Stored</w:t>
+            </w:r>
+            <w:proofErr w:type="spellEnd"/>
+            <w:r>
+              <w:t xml:space="preserve"> </w:t>
+            </w:r>
+            <w:proofErr w:type="spellStart"/>
+            <w:r>
+              <w:t>Procedures</w:t>
+            </w:r>
+            <w:proofErr w:type="spellEnd"/>
+            <w:r>
+              <w:t xml:space="preserve"> anlegen</w:t>
+            </w:r>
+            <w:r>
+              <w:t>, etc.</w:t>
+            </w:r>
+          </w:p>
+        </w:tc>
+        <w:tc>
+          <w:tcPr>
+            <w:tcW w:w="1181" w:type="dxa"/>
+          </w:tcPr>
+          <w:p>
+            <w:r>
+              <w:t>2</w:t>
+            </w:r>
+          </w:p>
+        </w:tc>
+      </w:tr>
+      <w:tr>
+        <w:tc>
+          <w:tcPr>
+            <w:tcW w:w="3037" w:type="dxa"/>
+          </w:tcPr>
+          <w:p>
+            <w:r>
+              <w:t>UI/UX</w:t>
+            </w:r>
+            <w:r>
+              <w:noBreakHyphen/>
+              <w:t>Konzept</w:t>
+            </w:r>
+          </w:p>
+        </w:tc>
+        <w:tc>
+          <w:tcPr>
+            <w:tcW w:w="4484" w:type="dxa"/>
+          </w:tcPr>
+          <w:p>
+            <w:r>
+              <w:t>Mockups für Besucher- und Mitarbeiterbereich, Navigationskonzept</w:t>
+            </w:r>
+          </w:p>
+        </w:tc>
+        <w:tc>
+          <w:tcPr>
+            <w:tcW w:w="1181" w:type="dxa"/>
+          </w:tcPr>
+          <w:p>
+            <w:r>
+              <w:t>2</w:t>
+            </w:r>
+          </w:p>
+        </w:tc>
+      </w:tr>
+      <w:tr>
+        <w:tc>
+          <w:tcPr>
+            <w:tcW w:w="3037" w:type="dxa"/>
+          </w:tcPr>
+          <w:p>
+            <w:r>
+              <w:t>Registrierung &amp; Login</w:t>
+            </w:r>
+          </w:p>
+        </w:tc>
+        <w:tc>
+          <w:tcPr>
+            <w:tcW w:w="4484" w:type="dxa"/>
+          </w:tcPr>
+          <w:p>
+            <w:r>
+              <w:t>Registrierung mit Rollenwahl (Besucher/Mitarbeiter), Login-Flow</w:t>
+            </w:r>
+          </w:p>
+        </w:tc>
+        <w:tc>
+          <w:tcPr>
+            <w:tcW w:w="1181" w:type="dxa"/>
+          </w:tcPr>
+          <w:p>
+            <w:r>
+              <w:t>2</w:t>
+            </w:r>
+          </w:p>
+        </w:tc>
+      </w:tr>
+      <w:tr>
+        <w:tc>
+          <w:tcPr>
+            <w:tcW w:w="3037" w:type="dxa"/>
+          </w:tcPr>
+          <w:p>
+            <w:r>
+              <w:t>Besucherbereich – Validierungsantrag</w:t>
+            </w:r>
+          </w:p>
+        </w:tc>
+        <w:tc>
+          <w:tcPr>
+            <w:tcW w:w="4484" w:type="dxa"/>
+          </w:tcPr>
+          <w:p>
+            <w:r>
+              <w:t>Formular, Validierungsstatus prüfen, Antrag stellen</w:t>
+            </w:r>
+          </w:p>
+        </w:tc>
+        <w:tc>
+          <w:tcPr>
+            <w:tcW w:w="1181" w:type="dxa"/>
+          </w:tcPr>
+          <w:p>
+            <w:r>
+              <w:t>2</w:t>
+            </w:r>
+          </w:p>
+        </w:tc>
+      </w:tr>
+      <w:tr>
+        <w:tc>
+          <w:tcPr>
+            <w:tcW w:w="3037" w:type="dxa"/>
+          </w:tcPr>
+          <w:p>
+            <w:r>
+              <w:t>Besucherbereich – Gefangenen auswählen</w:t>
+            </w:r>
+          </w:p>
+        </w:tc>
+        <w:tc>
+          <w:tcPr>
+            <w:tcW w:w="4484" w:type="dxa"/>
+          </w:tcPr>
+          <w:p>
+            <w:r>
+              <w:t>Liste der Gefangenen anzeigen</w:t>
+            </w:r>
+            <w:r>
+              <w:t xml:space="preserve">, für die man validiert </w:t>
+            </w:r>
+            <w:proofErr w:type="gramStart"/>
+            <w:r>
+              <w:t>ist</w:t>
+            </w:r>
+            <w:proofErr w:type="gramEnd"/>
+          </w:p>
+        </w:tc>
+        <w:tc>
+          <w:tcPr>
+            <w:tcW w:w="1181" w:type="dxa"/>
+          </w:tcPr>
+          <w:p>
+            <w:r>
+              <w:t>1</w:t>
+            </w:r>
+          </w:p>
+        </w:tc>
+      </w:tr>
+      <w:tr>
+        <w:tc>
+          <w:tcPr>
+            <w:tcW w:w="3037" w:type="dxa"/>
+          </w:tcPr>
+          <w:p>
+            <w:r>
+              <w:t xml:space="preserve">Besucherbereich – </w:t>
+            </w:r>
+            <w:proofErr w:type="spellStart"/>
+            <w:r>
+              <w:t>Besuchbarkeit</w:t>
+            </w:r>
+            <w:proofErr w:type="spellEnd"/>
+            <w:r>
+              <w:t xml:space="preserve"> prüfen</w:t>
+            </w:r>
+          </w:p>
+        </w:tc>
+        <w:tc>
+          <w:tcPr>
+            <w:tcW w:w="4484" w:type="dxa"/>
+          </w:tcPr>
+          <w:p>
+            <w:proofErr w:type="spellStart"/>
+            <w:r>
+              <w:t>Besuchbarkeit</w:t>
+            </w:r>
+            <w:proofErr w:type="spellEnd"/>
+            <w:r>
+              <w:t xml:space="preserve"> eines Gefangenen anzeigen</w:t>
+            </w:r>
+          </w:p>
+        </w:tc>
+        <w:tc>
+          <w:tcPr>
+            <w:tcW w:w="1181" w:type="dxa"/>
+          </w:tcPr>
+          <w:p>
+            <w:r>
+              <w:t>1</w:t>
+            </w:r>
+          </w:p>
+        </w:tc>
+      </w:tr>
+      <w:tr>
+        <w:tc>
+          <w:tcPr>
+            <w:tcW w:w="3037" w:type="dxa"/>
+          </w:tcPr>
+          <w:p>
+            <w:r>
+              <w:t>Besucherbereich – Besuchsslots anzeigen</w:t>
+            </w:r>
+          </w:p>
+        </w:tc>
+        <w:tc>
+          <w:tcPr>
+            <w:tcW w:w="4484" w:type="dxa"/>
+          </w:tcPr>
+          <w:p>
+            <w:r>
+              <w:t>Besuchszeiten aus DB laden, verfügbare Slots filtern</w:t>
+            </w:r>
+          </w:p>
+        </w:tc>
+        <w:tc>
+          <w:tcPr>
+            <w:tcW w:w="1181" w:type="dxa"/>
+          </w:tcPr>
+          <w:p>
+            <w:r>
+              <w:t>2</w:t>
+            </w:r>
+          </w:p>
+        </w:tc>
+      </w:tr>
+      <w:tr>
+        <w:tc>
+          <w:tcPr>
+            <w:tcW w:w="3037" w:type="dxa"/>
+          </w:tcPr>
+          <w:p>
+            <w:r>
+              <w:t>Besucherbereich – Termin buchen</w:t>
+            </w:r>
+          </w:p>
+        </w:tc>
+        <w:tc>
+          <w:tcPr>
+            <w:tcW w:w="4484" w:type="dxa"/>
+          </w:tcPr>
+          <w:p>
+            <w:r>
+              <w:t>Termin speichern, Bestätigung anzeigen</w:t>
+            </w:r>
+          </w:p>
+        </w:tc>
+        <w:tc>
+          <w:tcPr>
+            <w:tcW w:w="1181" w:type="dxa"/>
+          </w:tcPr>
+          <w:p>
+            <w:r>
+              <w:t>2</w:t>
+            </w:r>
+          </w:p>
+        </w:tc>
+      </w:tr>
+      <w:tr>
+        <w:tc>
+          <w:tcPr>
+            <w:tcW w:w="3037" w:type="dxa"/>
+          </w:tcPr>
+          <w:p>
+            <w:r>
+              <w:t>Mitarbeiterbereich – Validierungsanfragen anzeigen</w:t>
+            </w:r>
+          </w:p>
+        </w:tc>
+        <w:tc>
+          <w:tcPr>
+            <w:tcW w:w="4484" w:type="dxa"/>
+          </w:tcPr>
+          <w:p>
+            <w:r>
+              <w:t>Liste eingehender Anfragen</w:t>
+            </w:r>
+          </w:p>
+        </w:tc>
+        <w:tc>
+          <w:tcPr>
+            <w:tcW w:w="1181" w:type="dxa"/>
+          </w:tcPr>
+          <w:p>
+            <w:r>
+              <w:t>1</w:t>
+            </w:r>
+          </w:p>
+        </w:tc>
+      </w:tr>
+      <w:tr>
+        <w:tc>
+          <w:tcPr>
+            <w:tcW w:w="3037" w:type="dxa"/>
+          </w:tcPr>
+          <w:p>
+            <w:r>
+              <w:t>Mitarbeiterbereich – Validierung prüfen</w:t>
+            </w:r>
+          </w:p>
+        </w:tc>
+        <w:tc>
+          <w:tcPr>
+            <w:tcW w:w="4484" w:type="dxa"/>
+          </w:tcPr>
+          <w:p>
+            <w:r>
+              <w:t>Daten prüfen, Entscheidung treffen</w:t>
+            </w:r>
+          </w:p>
+        </w:tc>
+        <w:tc>
+          <w:tcPr>
+            <w:tcW w:w="1181" w:type="dxa"/>
+          </w:tcPr>
+          <w:p>
+            <w:r>
+              <w:t>1</w:t>
+            </w:r>
+          </w:p>
+        </w:tc>
+      </w:tr>
+      <w:tr>
+        <w:tc>
+          <w:tcPr>
+            <w:tcW w:w="3037" w:type="dxa"/>
+          </w:tcPr>
+          <w:p>
+            <w:r>
+              <w:t>Mitarbeiterbereich – Rückmeldung an Besucher</w:t>
+            </w:r>
+          </w:p>
+        </w:tc>
+        <w:tc>
+          <w:tcPr>
+            <w:tcW w:w="4484" w:type="dxa"/>
+          </w:tcPr>
+          <w:p>
+            <w:r>
+              <w:t>Validierung bestätigen/ablehnen</w:t>
+            </w:r>
+          </w:p>
+        </w:tc>
+        <w:tc>
+          <w:tcPr>
+            <w:tcW w:w="1181" w:type="dxa"/>
+          </w:tcPr>
+          <w:p>
+            <w:r>
+              <w:t>0,5</w:t>
+            </w:r>
+          </w:p>
+        </w:tc>
+      </w:tr>
+      <w:tr>
+        <w:tc>
+          <w:tcPr>
+            <w:tcW w:w="3037" w:type="dxa"/>
+          </w:tcPr>
+          <w:p>
+            <w:r>
+              <w:t>Mitarbeiterbereich – Gefangenenstatus ändern</w:t>
+            </w:r>
+          </w:p>
+        </w:tc>
+        <w:tc>
+          <w:tcPr>
+            <w:tcW w:w="4484" w:type="dxa"/>
+          </w:tcPr>
+          <w:p>
+            <w:proofErr w:type="spellStart"/>
+            <w:r>
+              <w:t>Besuchbarkeit</w:t>
+            </w:r>
+            <w:proofErr w:type="spellEnd"/>
+            <w:r>
+              <w:t xml:space="preserve"> setzen (Ja/Nein), speichern</w:t>
+            </w:r>
+          </w:p>
+        </w:tc>
+        <w:tc>
+          <w:tcPr>
+            <w:tcW w:w="1181" w:type="dxa"/>
+          </w:tcPr>
+          <w:p>
+            <w:r>
+              <w:t>0,5</w:t>
+            </w:r>
+          </w:p>
+        </w:tc>
+      </w:tr>
+      <w:tr>
+        <w:tc>
+          <w:tcPr>
+            <w:tcW w:w="3037" w:type="dxa"/>
+          </w:tcPr>
+          <w:p>
+            <w:proofErr w:type="spellStart"/>
+            <w:r>
+              <w:lastRenderedPageBreak/>
+              <w:t>Testing</w:t>
+            </w:r>
+            <w:proofErr w:type="spellEnd"/>
+          </w:p>
+        </w:tc>
+        <w:tc>
+          <w:tcPr>
+            <w:tcW w:w="4484" w:type="dxa"/>
+          </w:tcPr>
+          <w:p>
+            <w:r>
+              <w:t>Funktioniert alles so, wie es soll</w:t>
+            </w:r>
+          </w:p>
+        </w:tc>
+        <w:tc>
+          <w:tcPr>
+            <w:tcW w:w="1181" w:type="dxa"/>
+          </w:tcPr>
+          <w:p>
+            <w:r>
+              <w:t>2</w:t>
+            </w:r>
+          </w:p>
+        </w:tc>
+      </w:tr>
+      <w:tr>
+        <w:tc>
+          <w:tcPr>
+            <w:tcW w:w="3037" w:type="dxa"/>
+          </w:tcPr>
+          <w:p>
+            <w:r>
+              <w:t>Projektdokumentation</w:t>
+            </w:r>
+          </w:p>
+        </w:tc>
+        <w:tc>
+          <w:tcPr>
+            <w:tcW w:w="4484" w:type="dxa"/>
+          </w:tcPr>
+          <w:p>
+            <w:r>
+              <w:t>Architektur, Datenbank, Prozesse, Screenshots</w:t>
+            </w:r>
+          </w:p>
+        </w:tc>
+        <w:tc>
+          <w:tcPr>
+            <w:tcW w:w="1181" w:type="dxa"/>
+          </w:tcPr>
+          <w:p>
+            <w:r>
+              <w:t>3</w:t>
+            </w:r>
+          </w:p>
+        </w:tc>
+      </w:tr>
+      <w:tr>
+        <w:tc>
+          <w:tcPr>
+            <w:tcW w:w="3037" w:type="dxa"/>
+          </w:tcPr>
+          <w:p>
+            <w:r>
+              <w:t>Projektmanagement</w:t>
+            </w:r>
+          </w:p>
+        </w:tc>
+        <w:tc>
+          <w:tcPr>
+            <w:tcW w:w="4484" w:type="dxa"/>
+          </w:tcPr>
+          <w:p>
+            <w:r>
+              <w:t>Meetings, Abstimmung, Planung</w:t>
+            </w:r>
+          </w:p>
+        </w:tc>
+        <w:tc>
+          <w:tcPr>
+            <w:tcW w:w="1181" w:type="dxa"/>
+          </w:tcPr>
+          <w:p>
+            <w:r>
+              <w:t>3</w:t>
+            </w:r>
+          </w:p>
+        </w:tc>
+      </w:tr>
+    </w:tbl>
+    <w:p/>
+    <w:p>
+      <w:pPr>
+        <w:pStyle w:val="Listenabsatz"/>
+        <w:numPr>
+          <w:ilvl w:val="0"/>
+          <w:numId w:val="6"/>
+        </w:numPr>
+        <w:rPr>
+          <w:b/>
+          <w:bCs/>
+          <w:sz w:val="32"/>
+          <w:szCs w:val="32"/>
+        </w:rPr>
+      </w:pPr>
+      <w:r>
+        <w:rPr>
+          <w:b/>
+          <w:bCs/>
+          <w:sz w:val="32"/>
+          <w:szCs w:val="32"/>
+        </w:rPr>
+        <w:t>Aufwandsverteilung</w:t>
+      </w:r>
+    </w:p>
+    <w:p>
+      <w:pPr>
         <w:ind w:left="360"/>
-      </w:pPr>
+        <w:rPr>
+          <w:b/>
+          <w:bCs/>
+        </w:rPr>
+      </w:pPr>
+      <w:r>
+        <w:rPr>
+          <w:b/>
+          <w:bCs/>
+        </w:rPr>
+        <w:t>Gruppenmitglieder:</w:t>
+      </w:r>
+    </w:p>
+    <w:p>
+      <w:pPr>
+        <w:ind w:left="360"/>
+      </w:pPr>
+      <w:r>
+        <w:t>Manuel Borghardt</w:t>
+      </w:r>
+      <w:r>
+        <w:t xml:space="preserve">, </w:t>
+      </w:r>
+      <w:r>
+        <w:t>Darnell Borghardt</w:t>
+      </w:r>
+      <w:r>
+        <w:t xml:space="preserve">, </w:t>
+      </w:r>
+      <w:r>
+        <w:t>Leonid Nikkel</w:t>
+      </w:r>
+      <w:r>
+        <w:t xml:space="preserve">, </w:t>
+      </w:r>
+      <w:r>
+        <w:t>Joel Jantschik</w:t>
+      </w:r>
+      <w:r>
+        <w:t xml:space="preserve">, </w:t>
+      </w:r>
+      <w:r>
+        <w:t>Joshua Del Rosario Rijo</w:t>
+      </w:r>
+    </w:p>
+    <w:p>
+      <w:pPr>
+        <w:ind w:left="360"/>
+      </w:pPr>
+      <w:r>
+        <w:rPr>
+          <w:b/>
+          <w:bCs/>
+        </w:rPr>
+        <w:t>Prozesserstellung:</w:t>
+      </w:r>
+      <w:r>
+        <w:t xml:space="preserve"> Alle</w:t>
+      </w:r>
+    </w:p>
+    <w:p>
+      <w:pPr>
+        <w:ind w:left="360"/>
+      </w:pPr>
+      <w:r>
+        <w:rPr>
+          <w:b/>
+          <w:bCs/>
+        </w:rPr>
+        <w:t>BPMN:</w:t>
+      </w:r>
+      <w:r>
+        <w:t xml:space="preserve"> Darnell Borghardt, Leonid Nikkel, Manuel Borghardt</w:t>
+      </w:r>
+    </w:p>
+    <w:p>
+      <w:pPr>
+        <w:ind w:left="360"/>
+      </w:pPr>
+      <w:r>
+        <w:rPr>
+          <w:b/>
+          <w:bCs/>
+        </w:rPr>
+        <w:t>Lasten- und Pflichtenheft:</w:t>
+      </w:r>
+      <w:r>
+        <w:t xml:space="preserve"> Alle</w:t>
+      </w:r>
+    </w:p>
+    <w:p>
+      <w:pPr>
+        <w:ind w:left="360"/>
+      </w:pPr>
+      <w:r>
+        <w:rPr>
+          <w:b/>
+          <w:bCs/>
+        </w:rPr>
+        <w:t>Datenbankanpassung</w:t>
+      </w:r>
+      <w:r>
+        <w:rPr>
+          <w:b/>
+          <w:bCs/>
+        </w:rPr>
+        <w:t xml:space="preserve"> (Tabellen)</w:t>
+      </w:r>
+      <w:r>
+        <w:rPr>
+          <w:b/>
+          <w:bCs/>
+        </w:rPr>
+        <w:t>:</w:t>
+      </w:r>
+      <w:r>
+        <w:t xml:space="preserve"> </w:t>
+      </w:r>
+      <w:r>
+        <w:t>Joshua Del Rosario Rijo</w:t>
+      </w:r>
+    </w:p>
+    <w:p>
+      <w:pPr>
+        <w:ind w:left="360"/>
+      </w:pPr>
+      <w:r>
+        <w:rPr>
+          <w:b/>
+          <w:bCs/>
+        </w:rPr>
+        <w:t>V</w:t>
+      </w:r>
+      <w:r>
+        <w:rPr>
+          <w:b/>
+          <w:bCs/>
+        </w:rPr>
+        <w:t xml:space="preserve">iews und </w:t>
+      </w:r>
+      <w:proofErr w:type="spellStart"/>
+      <w:r>
+        <w:rPr>
+          <w:b/>
+          <w:bCs/>
+        </w:rPr>
+        <w:t>Stored</w:t>
+      </w:r>
+      <w:proofErr w:type="spellEnd"/>
+      <w:r>
+        <w:rPr>
+          <w:b/>
+          <w:bCs/>
+        </w:rPr>
+        <w:t xml:space="preserve"> </w:t>
+      </w:r>
+      <w:proofErr w:type="spellStart"/>
+      <w:r>
+        <w:rPr>
+          <w:b/>
+          <w:bCs/>
+        </w:rPr>
+        <w:t>Procedures</w:t>
+      </w:r>
+      <w:proofErr w:type="spellEnd"/>
+      <w:r>
+        <w:rPr>
+          <w:b/>
+          <w:bCs/>
+        </w:rPr>
+        <w:t>:</w:t>
+      </w:r>
+      <w:r>
+        <w:t xml:space="preserve"> Alle</w:t>
+      </w:r>
+    </w:p>
+    <w:p>
+      <w:pPr>
+        <w:ind w:left="360"/>
+      </w:pPr>
+      <w:r>
+        <w:rPr>
+          <w:b/>
+          <w:bCs/>
+        </w:rPr>
+        <w:t>Applikationsentwicklung:</w:t>
+      </w:r>
+      <w:r>
+        <w:t xml:space="preserve"> Alle</w:t>
+      </w:r>
+    </w:p>
+    <w:p>
+      <w:pPr>
+        <w:ind w:left="360"/>
+      </w:pPr>
+      <w:r>
+        <w:rPr>
+          <w:b/>
+          <w:bCs/>
+        </w:rPr>
+        <w:t>Dokumentation:</w:t>
+      </w:r>
+      <w:r>
+        <w:t xml:space="preserve"> Alle</w:t>
+      </w:r>
     </w:p>
     <w:sectPr>
       <w:pgSz w:w="11906" w:h="16838"/>
@@ -1742,6 +2780,95 @@
     </w:lvl>
   </w:abstractNum>
   <w:abstractNum w:abstractNumId="3" w15:restartNumberingAfterBreak="0">
+    <w:nsid w:val="4A7371D9"/>
+    <w:multiLevelType w:val="hybridMultilevel"/>
+    <w:tmpl w:val="0BF8A588"/>
+    <w:lvl w:ilvl="0" w:tplc="0407000F">
+      <w:start w:val="1"/>
+      <w:numFmt w:val="decimal"/>
+      <w:lvlText w:val="%1."/>
+      <w:lvlJc w:val="left"/>
+      <w:pPr>
+        <w:ind w:left="720" w:hanging="360"/>
+      </w:pPr>
+      <w:rPr>
+        <w:rFonts w:hint="default"/>
+      </w:rPr>
+    </w:lvl>
+    <w:lvl w:ilvl="1" w:tplc="04070019" w:tentative="1">
+      <w:start w:val="1"/>
+      <w:numFmt w:val="lowerLetter"/>
+      <w:lvlText w:val="%2."/>
+      <w:lvlJc w:val="left"/>
+      <w:pPr>
+        <w:ind w:left="1440" w:hanging="360"/>
+      </w:pPr>
+    </w:lvl>
+    <w:lvl w:ilvl="2" w:tplc="0407001B" w:tentative="1">
+      <w:start w:val="1"/>
+      <w:numFmt w:val="lowerRoman"/>
+      <w:lvlText w:val="%3."/>
+      <w:lvlJc w:val="right"/>
+      <w:pPr>
+        <w:ind w:left="2160" w:hanging="180"/>
+      </w:pPr>
+    </w:lvl>
+    <w:lvl w:ilvl="3" w:tplc="0407000F" w:tentative="1">
+      <w:start w:val="1"/>
+      <w:numFmt w:val="decimal"/>
+      <w:lvlText w:val="%4."/>
+      <w:lvlJc w:val="left"/>
+      <w:pPr>
+        <w:ind w:left="2880" w:hanging="360"/>
+      </w:pPr>
+    </w:lvl>
+    <w:lvl w:ilvl="4" w:tplc="04070019" w:tentative="1">
+      <w:start w:val="1"/>
+      <w:numFmt w:val="lowerLetter"/>
+      <w:lvlText w:val="%5."/>
+      <w:lvlJc w:val="left"/>
+      <w:pPr>
+        <w:ind w:left="3600" w:hanging="360"/>
+      </w:pPr>
+    </w:lvl>
+    <w:lvl w:ilvl="5" w:tplc="0407001B" w:tentative="1">
+      <w:start w:val="1"/>
+      <w:numFmt w:val="lowerRoman"/>
+      <w:lvlText w:val="%6."/>
+      <w:lvlJc w:val="right"/>
+      <w:pPr>
+        <w:ind w:left="4320" w:hanging="180"/>
+      </w:pPr>
+    </w:lvl>
+    <w:lvl w:ilvl="6" w:tplc="0407000F" w:tentative="1">
+      <w:start w:val="1"/>
+      <w:numFmt w:val="decimal"/>
+      <w:lvlText w:val="%7."/>
+      <w:lvlJc w:val="left"/>
+      <w:pPr>
+        <w:ind w:left="5040" w:hanging="360"/>
+      </w:pPr>
+    </w:lvl>
+    <w:lvl w:ilvl="7" w:tplc="04070019" w:tentative="1">
+      <w:start w:val="1"/>
+      <w:numFmt w:val="lowerLetter"/>
+      <w:lvlText w:val="%8."/>
+      <w:lvlJc w:val="left"/>
+      <w:pPr>
+        <w:ind w:left="5760" w:hanging="360"/>
+      </w:pPr>
+    </w:lvl>
+    <w:lvl w:ilvl="8" w:tplc="0407001B" w:tentative="1">
+      <w:start w:val="1"/>
+      <w:numFmt w:val="lowerRoman"/>
+      <w:lvlText w:val="%9."/>
+      <w:lvlJc w:val="right"/>
+      <w:pPr>
+        <w:ind w:left="6480" w:hanging="180"/>
+      </w:pPr>
+    </w:lvl>
+  </w:abstractNum>
+  <w:abstractNum w:abstractNumId="4" w15:restartNumberingAfterBreak="0">
     <w:nsid w:val="4B3B5602"/>
     <w:multiLevelType w:val="hybridMultilevel"/>
     <w:tmpl w:val="B64AAB96"/>
@@ -1854,7 +2981,7 @@
       </w:rPr>
     </w:lvl>
   </w:abstractNum>
-  <w:abstractNum w:abstractNumId="4" w15:restartNumberingAfterBreak="0">
+  <w:abstractNum w:abstractNumId="5" w15:restartNumberingAfterBreak="0">
     <w:nsid w:val="68DE64BF"/>
     <w:multiLevelType w:val="multilevel"/>
     <w:tmpl w:val="9DE4C858"/>
@@ -2007,7 +3134,7 @@
     <w:abstractNumId w:val="2"/>
   </w:num>
   <w:num w:numId="2" w16cid:durableId="1480540451">
-    <w:abstractNumId w:val="3"/>
+    <w:abstractNumId w:val="4"/>
   </w:num>
   <w:num w:numId="3" w16cid:durableId="1381319068">
     <w:abstractNumId w:val="0"/>
@@ -2016,7 +3143,10 @@
     <w:abstractNumId w:val="1"/>
   </w:num>
   <w:num w:numId="5" w16cid:durableId="698699320">
-    <w:abstractNumId w:val="4"/>
+    <w:abstractNumId w:val="5"/>
+  </w:num>
+  <w:num w:numId="6" w16cid:durableId="535655691">
+    <w:abstractNumId w:val="3"/>
   </w:num>
 </w:numbering>
 </file>
@@ -2953,6 +4083,25 @@
       <w14:ligatures w14:val="none"/>
     </w:rPr>
   </w:style>
+  <w:style w:type="table" w:styleId="Tabellenraster">
+    <w:name w:val="Table Grid"/>
+    <w:basedOn w:val="NormaleTabelle"/>
+    <w:uiPriority w:val="39"/>
+    <w:rsid w:val="00B025E5"/>
+    <w:pPr>
+      <w:spacing w:after="0" w:line="240" w:lineRule="auto"/>
+    </w:pPr>
+    <w:tblPr>
+      <w:tblBorders>
+        <w:top w:val="single" w:sz="4" w:space="0" w:color="auto"/>
+        <w:left w:val="single" w:sz="4" w:space="0" w:color="auto"/>
+        <w:bottom w:val="single" w:sz="4" w:space="0" w:color="auto"/>
+        <w:right w:val="single" w:sz="4" w:space="0" w:color="auto"/>
+        <w:insideH w:val="single" w:sz="4" w:space="0" w:color="auto"/>
+        <w:insideV w:val="single" w:sz="4" w:space="0" w:color="auto"/>
+      </w:tblBorders>
+    </w:tblPr>
+  </w:style>
 </w:styles>
 </file>
 

</xml_diff>

<commit_message>
Regestrierung und Anmeldung implementiert. Jenachdem ob man sich als Besucher oder Mitarbeiter regestriert hat, wird man auf das Dashboard vom Besucher oder vom Mitarbeiter geleitet.
</commit_message>
<xml_diff>
--- a/Dokumentation/Lastenheft_pflichtenheft_LockUpLogic.docx
+++ b/Dokumentation/Lastenheft_pflichtenheft_LockUpLogic.docx
@@ -47,17 +47,8 @@
         <w:ind w:left="360"/>
       </w:pPr>
       <w:r>
-        <w:t xml:space="preserve">Die JVA </w:t>
-      </w:r>
-      <w:proofErr w:type="spellStart"/>
-      <w:r>
-        <w:t>LockUpLogic</w:t>
-      </w:r>
-      <w:proofErr w:type="spellEnd"/>
-      <w:r>
-        <w:t xml:space="preserve"> benötigt eine digitale Lösung zur effizienten Verwaltung von Besucherregistrierung, Validierung und Terminbuchung. Die Anwendung </w:t>
-      </w:r>
-      <w:proofErr w:type="spellStart"/>
+        <w:t xml:space="preserve">Die JVA LockUpLogic benötigt eine digitale Lösung zur effizienten Verwaltung von Besucherregistrierung, Validierung und Terminbuchung. Die Anwendung </w:t>
+      </w:r>
       <w:r>
         <w:rPr>
           <w:i/>
@@ -65,7 +56,6 @@
         </w:rPr>
         <w:t>LockedVisit</w:t>
       </w:r>
-      <w:proofErr w:type="spellEnd"/>
       <w:r>
         <w:t xml:space="preserve"> soll den gesamten Besucherprozess abbilden und sowohl Besuchern als auch de</w:t>
       </w:r>
@@ -139,15 +129,7 @@
         </w:numPr>
       </w:pPr>
       <w:r>
-        <w:t xml:space="preserve">Gefangene (indirekt über </w:t>
-      </w:r>
-      <w:proofErr w:type="spellStart"/>
-      <w:r>
-        <w:t>Besuchbarkeit</w:t>
-      </w:r>
-      <w:proofErr w:type="spellEnd"/>
-      <w:r>
-        <w:t>)</w:t>
+        <w:t>Gefangene (indirekt über Besuchbarkeit)</w:t>
       </w:r>
     </w:p>
     <w:p>
@@ -178,7 +160,6 @@
       <w:pPr>
         <w:ind w:left="360"/>
       </w:pPr>
-      <w:proofErr w:type="spellStart"/>
       <w:r>
         <w:rPr>
           <w:i/>
@@ -186,7 +167,6 @@
         </w:rPr>
         <w:t>LockedVisit</w:t>
       </w:r>
-      <w:proofErr w:type="spellEnd"/>
       <w:r>
         <w:t xml:space="preserve"> unterstützt Besucher bei Registrierung, Validierung und Terminbuchung. Mitarbeiter erhalten Werkzeuge zur Bearbeitung von Validierungsanfragen und zur Pflege des Besuchsstatus von Gefangenen. Die Anwendung trennt beide Rollen klar voneinander.</w:t>
       </w:r>
@@ -319,13 +299,8 @@
           <w:numId w:val="2"/>
         </w:numPr>
       </w:pPr>
-      <w:proofErr w:type="spellStart"/>
-      <w:r>
-        <w:t>Besuchbarkeit</w:t>
-      </w:r>
-      <w:proofErr w:type="spellEnd"/>
-      <w:r>
-        <w:t xml:space="preserve"> prüfen</w:t>
+      <w:r>
+        <w:t>Besuchbarkeit prüfen</w:t>
       </w:r>
     </w:p>
     <w:p>
@@ -935,7 +910,6 @@
       <w:r>
         <w:t xml:space="preserve">Die Anwendung </w:t>
       </w:r>
-      <w:proofErr w:type="spellStart"/>
       <w:r>
         <w:rPr>
           <w:i/>
@@ -943,7 +917,6 @@
         </w:rPr>
         <w:t>LockedVisit</w:t>
       </w:r>
-      <w:proofErr w:type="spellEnd"/>
       <w:r>
         <w:t xml:space="preserve"> besteht aus zwei getrennten Benutzerbereichen: </w:t>
       </w:r>
@@ -1057,13 +1030,8 @@
         </w:numPr>
       </w:pPr>
       <w:r>
-        <w:t xml:space="preserve">Prüfung der </w:t>
-      </w:r>
-      <w:proofErr w:type="spellStart"/>
-      <w:r>
-        <w:t>Besuchbarkeit</w:t>
-      </w:r>
-      <w:proofErr w:type="spellEnd"/>
+        <w:t>Prüfung der Besuchbarkeit</w:t>
+      </w:r>
     </w:p>
     <w:p>
       <w:pPr>
@@ -1314,7 +1282,16 @@
           <w:sz w:val="32"/>
           <w:szCs w:val="32"/>
         </w:rPr>
-        <w:t>Technische Architektur</w:t>
+        <w:t>Verwendete</w:t>
+      </w:r>
+      <w:r>
+        <w:rPr>
+          <w:b/>
+          <w:bCs/>
+          <w:sz w:val="32"/>
+          <w:szCs w:val="32"/>
+        </w:rPr>
+        <w:t xml:space="preserve"> Architektur</w:t>
       </w:r>
     </w:p>
     <w:p>
@@ -1363,6 +1340,38 @@
       </w:pPr>
       <w:r>
         <w:t>ORACLE DBMS</w:t>
+      </w:r>
+    </w:p>
+    <w:p>
+      <w:pPr>
+        <w:ind w:left="360"/>
+        <w:rPr>
+          <w:b/>
+          <w:bCs/>
+        </w:rPr>
+      </w:pPr>
+      <w:r>
+        <w:rPr>
+          <w:b/>
+          <w:bCs/>
+        </w:rPr>
+        <w:t>Begründung der Wahl:</w:t>
+      </w:r>
+    </w:p>
+    <w:p>
+      <w:pPr>
+        <w:ind w:left="360"/>
+      </w:pPr>
+      <w:r>
+        <w:t>Mit PHP haben wir noch keine Erfahrung, weshalb wir mit diesem Projekt etwas PHP lernen. Zudem ist es eine vergleichbar einfache Skript-Sprache.</w:t>
+      </w:r>
+      <w:r>
+        <w:br/>
+        <w:t>Für CSS haben wir uns entschieden, um die Applikation übersichtlicher und schicker zu gestalten.</w:t>
+      </w:r>
+      <w:r>
+        <w:br/>
+        <w:t>Und die ORACLE DBMS wurde gewählt, weil wir uns nicht mit einem neuen DBMS beschäftigen wollen und den Fokus mehr auf die Prozesse und Applikation legen wollen.</w:t>
       </w:r>
     </w:p>
     <w:p>
@@ -1590,31 +1599,7 @@
               <w:t>Tabellen erweitern (Gefangener, Besucher), neue Tabelle Besuchszeiten modellieren</w:t>
             </w:r>
             <w:r>
-              <w:t xml:space="preserve">, </w:t>
-            </w:r>
-            <w:proofErr w:type="spellStart"/>
-            <w:r>
-              <w:t>views</w:t>
-            </w:r>
-            <w:proofErr w:type="spellEnd"/>
-            <w:r>
-              <w:t xml:space="preserve"> und </w:t>
-            </w:r>
-            <w:proofErr w:type="spellStart"/>
-            <w:r>
-              <w:t>Stored</w:t>
-            </w:r>
-            <w:proofErr w:type="spellEnd"/>
-            <w:r>
-              <w:t xml:space="preserve"> </w:t>
-            </w:r>
-            <w:proofErr w:type="spellStart"/>
-            <w:r>
-              <w:t>Procedures</w:t>
-            </w:r>
-            <w:proofErr w:type="spellEnd"/>
-            <w:r>
-              <w:t xml:space="preserve"> anlegen</w:t>
+              <w:t>, views und Stored Procedures anlegen</w:t>
             </w:r>
             <w:r>
               <w:t>, etc.</w:t>
@@ -1752,13 +1737,8 @@
               <w:t>Liste der Gefangenen anzeigen</w:t>
             </w:r>
             <w:r>
-              <w:t xml:space="preserve">, für die man validiert </w:t>
-            </w:r>
-            <w:proofErr w:type="gramStart"/>
-            <w:r>
-              <w:t>ist</w:t>
-            </w:r>
-            <w:proofErr w:type="gramEnd"/>
+              <w:t>, für die man validiert ist</w:t>
+            </w:r>
           </w:p>
         </w:tc>
         <w:tc>
@@ -1779,15 +1759,7 @@
           </w:tcPr>
           <w:p>
             <w:r>
-              <w:t xml:space="preserve">Besucherbereich – </w:t>
-            </w:r>
-            <w:proofErr w:type="spellStart"/>
-            <w:r>
-              <w:t>Besuchbarkeit</w:t>
-            </w:r>
-            <w:proofErr w:type="spellEnd"/>
-            <w:r>
-              <w:t xml:space="preserve"> prüfen</w:t>
+              <w:t>Besucherbereich – Besuchbarkeit prüfen</w:t>
             </w:r>
           </w:p>
         </w:tc>
@@ -1796,13 +1768,8 @@
             <w:tcW w:w="4484" w:type="dxa"/>
           </w:tcPr>
           <w:p>
-            <w:proofErr w:type="spellStart"/>
-            <w:r>
-              <w:t>Besuchbarkeit</w:t>
-            </w:r>
-            <w:proofErr w:type="spellEnd"/>
-            <w:r>
-              <w:t xml:space="preserve"> eines Gefangenen anzeigen</w:t>
+            <w:r>
+              <w:t>Besuchbarkeit eines Gefangenen anzeigen</w:t>
             </w:r>
           </w:p>
         </w:tc>
@@ -1856,6 +1823,7 @@
           </w:tcPr>
           <w:p>
             <w:r>
+              <w:lastRenderedPageBreak/>
               <w:t>Besucherbereich – Termin buchen</w:t>
             </w:r>
           </w:p>
@@ -1993,13 +1961,8 @@
             <w:tcW w:w="4484" w:type="dxa"/>
           </w:tcPr>
           <w:p>
-            <w:proofErr w:type="spellStart"/>
-            <w:r>
-              <w:t>Besuchbarkeit</w:t>
-            </w:r>
-            <w:proofErr w:type="spellEnd"/>
-            <w:r>
-              <w:t xml:space="preserve"> setzen (Ja/Nein), speichern</w:t>
+            <w:r>
+              <w:t>Besuchbarkeit setzen (Ja/Nein), speichern</w:t>
             </w:r>
           </w:p>
         </w:tc>
@@ -2020,12 +1983,9 @@
             <w:tcW w:w="3037" w:type="dxa"/>
           </w:tcPr>
           <w:p>
-            <w:proofErr w:type="spellStart"/>
-            <w:r>
-              <w:lastRenderedPageBreak/>
+            <w:r>
               <w:t>Testing</w:t>
             </w:r>
-            <w:proofErr w:type="spellEnd"/>
           </w:p>
         </w:tc>
         <w:tc>
@@ -2273,46 +2233,7 @@
           <w:b/>
           <w:bCs/>
         </w:rPr>
-        <w:t>V</w:t>
-      </w:r>
-      <w:r>
-        <w:rPr>
-          <w:b/>
-          <w:bCs/>
-        </w:rPr>
-        <w:t xml:space="preserve">iews und </w:t>
-      </w:r>
-      <w:proofErr w:type="spellStart"/>
-      <w:r>
-        <w:rPr>
-          <w:b/>
-          <w:bCs/>
-        </w:rPr>
-        <w:t>Stored</w:t>
-      </w:r>
-      <w:proofErr w:type="spellEnd"/>
-      <w:r>
-        <w:rPr>
-          <w:b/>
-          <w:bCs/>
-        </w:rPr>
-        <w:t xml:space="preserve"> </w:t>
-      </w:r>
-      <w:proofErr w:type="spellStart"/>
-      <w:r>
-        <w:rPr>
-          <w:b/>
-          <w:bCs/>
-        </w:rPr>
-        <w:t>Procedures</w:t>
-      </w:r>
-      <w:proofErr w:type="spellEnd"/>
-      <w:r>
-        <w:rPr>
-          <w:b/>
-          <w:bCs/>
-        </w:rPr>
-        <w:t>:</w:t>
+        <w:t>Views und Stored Procedures:</w:t>
       </w:r>
       <w:r>
         <w:t xml:space="preserve"> Alle</w:t>

</xml_diff>